<commit_message>
Update master registration rules: fix date, typo, add code annotation
</commit_message>
<xml_diff>
--- a/サキュレ_得意先拠点マスター登録規程.docx
+++ b/サキュレ_得意先拠点マスター登録規程.docx
@@ -81,7 +81,7 @@
               </w:rPr>
               <w:t>制定日</w:t>
               <w:br/>
-              <w:t>令和7年　　月　　日</w:t>
+              <w:t>令和8年6月19日</w:t>
             </w:r>
           </w:p>
         </w:tc>
@@ -587,6 +587,58 @@
         </w:tc>
       </w:tr>
     </w:tbl>
+    <w:p>
+      <w:pPr>
+        <w:ind w:left="360"/>
+        <w:spacing w:before="80" w:after="80"/>
+      </w:pPr>
+      <w:r>
+        <w:rPr>
+          <w:sz w:val="18"/>
+          <w:color w:val="595959"/>
+        </w:rPr>
+        <w:t xml:space="preserve">【注釈】既存コードについて</w:t>
+      </w:r>
+    </w:p>
+    <w:p>
+      <w:pPr>
+        <w:ind w:left="360"/>
+        <w:spacing w:before="80" w:after="80"/>
+      </w:pPr>
+      <w:r>
+        <w:rPr>
+          <w:sz w:val="18"/>
+          <w:color w:val="595959"/>
+        </w:rPr>
+        <w:t xml:space="preserve">・ルート最適化ツールに登録済みの拠点コード（L0001〜L0500形式）は従来コードとして当面併用する。</w:t>
+      </w:r>
+    </w:p>
+    <w:p>
+      <w:pPr>
+        <w:ind w:left="360"/>
+        <w:spacing w:before="80" w:after="80"/>
+      </w:pPr>
+      <w:r>
+        <w:rPr>
+          <w:sz w:val="18"/>
+          <w:color w:val="595959"/>
+        </w:rPr>
+        <w:t xml:space="preserve">・TOKSストア等の既登録コード（TK-001〜TK-395形式）は上記TK-XXX体系と同一であり、そのまま有効とする。</w:t>
+      </w:r>
+    </w:p>
+    <w:p>
+      <w:pPr>
+        <w:ind w:left="360"/>
+        <w:spacing w:before="80" w:after="80"/>
+      </w:pPr>
+      <w:r>
+        <w:rPr>
+          <w:sz w:val="18"/>
+          <w:color w:val="595959"/>
+        </w:rPr>
+        <w:t xml:space="preserve">・新規登録は本規程のコード体系に従うこと。既存L番号の新体系への統一は年次棚卸のタイミングで順次対応する。</w:t>
+      </w:r>
+    </w:p>
     <w:p/>
     <w:p>
       <w:pPr>
@@ -1115,7 +1167,7 @@
                 <w:b w:val="0"/>
                 <w:sz w:val="20"/>
               </w:rPr>
-              <w:t>ｱｰﾙｷｭｰﾌﾞ　→　アールキュ－ブ</w:t>
+              <w:t>ｱｰﾙｷｭｰﾌﾞ　→　アールキューブ</w:t>
             </w:r>
           </w:p>
         </w:tc>
@@ -1967,7 +2019,7 @@
           <w:color w:val="1A1A1A"/>
           <w:sz w:val="20"/>
         </w:rPr>
-        <w:t>本規程は令和　　年　　月　　日より施行する。</w:t>
+        <w:t>本規程は令和8年6月19日より施行する。</w:t>
       </w:r>
     </w:p>
     <w:p>

</xml_diff>